<commit_message>
auto: updated CDN links and history log
</commit_message>
<xml_diff>
--- a/Generated_CDN_Links.docx
+++ b/Generated_CDN_Links.docx
@@ -7,7 +7,7 @@
         <w:pStyle w:val="Heading1"/>
       </w:pPr>
       <w:r>
-        <w:t xml:space="preserve">Automated CDN Links Log (Total Runs: 662)</w:t>
+        <w:t xml:space="preserve">Automated CDN Links Log (Total Runs: 665)</w:t>
       </w:r>
     </w:p>
     <w:p>
@@ -50319,6 +50319,234 @@
     <w:p>
       <w:r>
         <w:t xml:space="preserve">Skypack (ESM): https://cdn.skypack.dev/xskullx-auto-662-pkg</w:t>
+      </w:r>
+    </w:p>
+    <w:p/>
+    <w:p>
+      <w:pPr>
+        <w:pStyle w:val="Heading2"/>
+      </w:pPr>
+      <w:r>
+        <w:t xml:space="preserve">Instance: xskullx-auto-663 (8/31/2026, 4:27:23 PM)</w:t>
+      </w:r>
+    </w:p>
+    <w:p>
+      <w:r>
+        <w:t xml:space="preserve">=== SOURCE PLATFORMS ===</w:t>
+      </w:r>
+    </w:p>
+    <w:p>
+      <w:r>
+        <w:t xml:space="preserve">Vercel URL: https://xskullx-auto-663.vercel.app</w:t>
+      </w:r>
+    </w:p>
+    <w:p>
+      <w:r>
+        <w:t xml:space="preserve">GitHub Repo: https://github.com/Gamer69a/XSKULLX</w:t>
+      </w:r>
+    </w:p>
+    <w:p>
+      <w:r>
+        <w:t xml:space="preserve">npm Registry: https://www.npmjs.com/package/xskullx-auto-663-pkg</w:t>
+      </w:r>
+    </w:p>
+    <w:p/>
+    <w:p>
+      <w:r>
+        <w:t xml:space="preserve">=== AUTO-UPDATING CDN LINKS (ALWAYS LATEST) ===</w:t>
+      </w:r>
+    </w:p>
+    <w:p>
+      <w:r>
+        <w:t xml:space="preserve">UNPKG Latest: https://unpkg.com/xskullx-auto-663-pkg/index.html</w:t>
+      </w:r>
+    </w:p>
+    <w:p>
+      <w:r>
+        <w:t xml:space="preserve">jsDelivr Latest: https://cdn.jsdelivr.net/npm/xskullx-auto-663-pkg/index.html</w:t>
+      </w:r>
+    </w:p>
+    <w:p/>
+    <w:p>
+      <w:r>
+        <w:t xml:space="preserve">=== PINNED VERSION ARCHIVE ===</w:t>
+      </w:r>
+    </w:p>
+    <w:p>
+      <w:r>
+        <w:t xml:space="preserve">jsDelivr (GitHub): https://cdn.jsdelivr.net/gh/gamer69a/xskullx-auto-663@main/index.html</w:t>
+      </w:r>
+    </w:p>
+    <w:p>
+      <w:r>
+        <w:t xml:space="preserve">jsDelivr (Commit Hash): https://cdn.jsdelivr.net/gh/gamer69a/xskullx-auto-663@HEAD/index.html</w:t>
+      </w:r>
+    </w:p>
+    <w:p>
+      <w:r>
+        <w:t xml:space="preserve">rawgit.hack: https://rawgit.hack.workers.dev/gamer69a/xskullx-auto-663/main/index.html</w:t>
+      </w:r>
+    </w:p>
+    <w:p>
+      <w:r>
+        <w:t xml:space="preserve">HTMLPreview: https://htmlpreview.github.io/?https://github.com/gamer69a/xskullx-auto-663/blob/main/index.html</w:t>
+      </w:r>
+    </w:p>
+    <w:p>
+      <w:r>
+        <w:t xml:space="preserve">Skypack (ESM): https://cdn.skypack.dev/xskullx-auto-663-pkg</w:t>
+      </w:r>
+    </w:p>
+    <w:p/>
+    <w:p>
+      <w:pPr>
+        <w:pStyle w:val="Heading2"/>
+      </w:pPr>
+      <w:r>
+        <w:t xml:space="preserve">Instance: xskullx-auto-664 (8/31/2026, 4:27:23 PM)</w:t>
+      </w:r>
+    </w:p>
+    <w:p>
+      <w:r>
+        <w:t xml:space="preserve">=== SOURCE PLATFORMS ===</w:t>
+      </w:r>
+    </w:p>
+    <w:p>
+      <w:r>
+        <w:t xml:space="preserve">Vercel URL: https://xskullx-auto-664.vercel.app</w:t>
+      </w:r>
+    </w:p>
+    <w:p>
+      <w:r>
+        <w:t xml:space="preserve">GitHub Repo: https://github.com/Gamer69a/XSKULLX</w:t>
+      </w:r>
+    </w:p>
+    <w:p>
+      <w:r>
+        <w:t xml:space="preserve">npm Registry: https://www.npmjs.com/package/xskullx-auto-664-pkg</w:t>
+      </w:r>
+    </w:p>
+    <w:p/>
+    <w:p>
+      <w:r>
+        <w:t xml:space="preserve">=== AUTO-UPDATING CDN LINKS (ALWAYS LATEST) ===</w:t>
+      </w:r>
+    </w:p>
+    <w:p>
+      <w:r>
+        <w:t xml:space="preserve">UNPKG Latest: https://unpkg.com/xskullx-auto-664-pkg/index.html</w:t>
+      </w:r>
+    </w:p>
+    <w:p>
+      <w:r>
+        <w:t xml:space="preserve">jsDelivr Latest: https://cdn.jsdelivr.net/npm/xskullx-auto-664-pkg/index.html</w:t>
+      </w:r>
+    </w:p>
+    <w:p/>
+    <w:p>
+      <w:r>
+        <w:t xml:space="preserve">=== PINNED VERSION ARCHIVE ===</w:t>
+      </w:r>
+    </w:p>
+    <w:p>
+      <w:r>
+        <w:t xml:space="preserve">jsDelivr (GitHub): https://cdn.jsdelivr.net/gh/gamer69a/xskullx-auto-664@main/index.html</w:t>
+      </w:r>
+    </w:p>
+    <w:p>
+      <w:r>
+        <w:t xml:space="preserve">jsDelivr (Commit Hash): https://cdn.jsdelivr.net/gh/gamer69a/xskullx-auto-664@HEAD/index.html</w:t>
+      </w:r>
+    </w:p>
+    <w:p>
+      <w:r>
+        <w:t xml:space="preserve">rawgit.hack: https://rawgit.hack.workers.dev/gamer69a/xskullx-auto-664/main/index.html</w:t>
+      </w:r>
+    </w:p>
+    <w:p>
+      <w:r>
+        <w:t xml:space="preserve">HTMLPreview: https://htmlpreview.github.io/?https://github.com/gamer69a/xskullx-auto-664/blob/main/index.html</w:t>
+      </w:r>
+    </w:p>
+    <w:p>
+      <w:r>
+        <w:t xml:space="preserve">Skypack (ESM): https://cdn.skypack.dev/xskullx-auto-664-pkg</w:t>
+      </w:r>
+    </w:p>
+    <w:p/>
+    <w:p>
+      <w:pPr>
+        <w:pStyle w:val="Heading2"/>
+      </w:pPr>
+      <w:r>
+        <w:t xml:space="preserve">Instance: xskullx-auto-665 (8/31/2026, 4:27:23 PM)</w:t>
+      </w:r>
+    </w:p>
+    <w:p>
+      <w:r>
+        <w:t xml:space="preserve">=== SOURCE PLATFORMS ===</w:t>
+      </w:r>
+    </w:p>
+    <w:p>
+      <w:r>
+        <w:t xml:space="preserve">Vercel URL: https://xskullx-auto-665.vercel.app</w:t>
+      </w:r>
+    </w:p>
+    <w:p>
+      <w:r>
+        <w:t xml:space="preserve">GitHub Repo: https://github.com/Gamer69a/XSKULLX</w:t>
+      </w:r>
+    </w:p>
+    <w:p>
+      <w:r>
+        <w:t xml:space="preserve">npm Registry: https://www.npmjs.com/package/xskullx-auto-665-pkg</w:t>
+      </w:r>
+    </w:p>
+    <w:p/>
+    <w:p>
+      <w:r>
+        <w:t xml:space="preserve">=== AUTO-UPDATING CDN LINKS (ALWAYS LATEST) ===</w:t>
+      </w:r>
+    </w:p>
+    <w:p>
+      <w:r>
+        <w:t xml:space="preserve">UNPKG Latest: https://unpkg.com/xskullx-auto-665-pkg/index.html</w:t>
+      </w:r>
+    </w:p>
+    <w:p>
+      <w:r>
+        <w:t xml:space="preserve">jsDelivr Latest: https://cdn.jsdelivr.net/npm/xskullx-auto-665-pkg/index.html</w:t>
+      </w:r>
+    </w:p>
+    <w:p/>
+    <w:p>
+      <w:r>
+        <w:t xml:space="preserve">=== PINNED VERSION ARCHIVE ===</w:t>
+      </w:r>
+    </w:p>
+    <w:p>
+      <w:r>
+        <w:t xml:space="preserve">jsDelivr (GitHub): https://cdn.jsdelivr.net/gh/gamer69a/xskullx-auto-665@main/index.html</w:t>
+      </w:r>
+    </w:p>
+    <w:p>
+      <w:r>
+        <w:t xml:space="preserve">jsDelivr (Commit Hash): https://cdn.jsdelivr.net/gh/gamer69a/xskullx-auto-665@HEAD/index.html</w:t>
+      </w:r>
+    </w:p>
+    <w:p>
+      <w:r>
+        <w:t xml:space="preserve">rawgit.hack: https://rawgit.hack.workers.dev/gamer69a/xskullx-auto-665/main/index.html</w:t>
+      </w:r>
+    </w:p>
+    <w:p>
+      <w:r>
+        <w:t xml:space="preserve">HTMLPreview: https://htmlpreview.github.io/?https://github.com/gamer69a/xskullx-auto-665/blob/main/index.html</w:t>
+      </w:r>
+    </w:p>
+    <w:p>
+      <w:r>
+        <w:t xml:space="preserve">Skypack (ESM): https://cdn.skypack.dev/xskullx-auto-665-pkg</w:t>
       </w:r>
     </w:p>
     <w:p/>

</xml_diff>